<commit_message>
fix: documento sin notas sobre el propio texto ni GitFlow; presentación sin notas del orador
El guion queda en presentacion/ (general y uno por integrante).
</commit_message>
<xml_diff>
--- a/documento/Entrega - Caso Parquímetros.docx
+++ b/documento/Entrega - Caso Parquímetros.docx
@@ -399,7 +399,7 @@
           <w:b/>
           <w:sz w:val="21"/>
         </w:rPr>
-        <w:t>Equipo y correspondencia con la consigna</w:t>
+        <w:t>Equipo de trabajo</w:t>
         <w:tab/>
         <w:t>4</w:t>
       </w:r>
@@ -417,7 +417,7 @@
           <w:b w:val="0"/>
           <w:sz w:val="20"/>
         </w:rPr>
-        <w:t>Qué pide la consigna y dónde está</w:t>
+        <w:t>Alcance del análisis</w:t>
         <w:tab/>
         <w:t>4</w:t>
       </w:r>
@@ -435,9 +435,27 @@
           <w:b w:val="0"/>
           <w:sz w:val="20"/>
         </w:rPr>
-        <w:t>Declaraciones que condicionan todo el documento</w:t>
+        <w:t>Palabras que usamos</w:t>
         <w:tab/>
-        <w:t>4</w:t>
+        <w:t>5</w:t>
+      </w:r>
+    </w:p>
+    <w:p>
+      <w:pPr>
+        <w:tabs>
+          <w:tab w:pos="9360" w:val="right" w:leader="dot"/>
+        </w:tabs>
+        <w:spacing w:before="140" w:after="40" w:line="240" w:lineRule="auto"/>
+        <w:ind w:left="0"/>
+      </w:pPr>
+      <w:r>
+        <w:rPr>
+          <w:b/>
+          <w:sz w:val="21"/>
+        </w:rPr>
+        <w:t>1. Análisis del caso</w:t>
+        <w:tab/>
+        <w:t>6</w:t>
       </w:r>
     </w:p>
     <w:p>
@@ -453,9 +471,63 @@
           <w:b w:val="0"/>
           <w:sz w:val="20"/>
         </w:rPr>
-        <w:t>Palabras que usamos</w:t>
+        <w:t>1.1 De qué trata</w:t>
         <w:tab/>
-        <w:t>5</w:t>
+        <w:t>6</w:t>
+      </w:r>
+    </w:p>
+    <w:p>
+      <w:pPr>
+        <w:tabs>
+          <w:tab w:pos="9360" w:val="right" w:leader="dot"/>
+        </w:tabs>
+        <w:spacing w:before="0" w:after="40" w:line="240" w:lineRule="auto"/>
+        <w:ind w:left="432"/>
+      </w:pPr>
+      <w:r>
+        <w:rPr>
+          <w:b w:val="0"/>
+          <w:sz w:val="20"/>
+        </w:rPr>
+        <w:t>1.2 Involucrados (stakeholders)</w:t>
+        <w:tab/>
+        <w:t>6</w:t>
+      </w:r>
+    </w:p>
+    <w:p>
+      <w:pPr>
+        <w:tabs>
+          <w:tab w:pos="9360" w:val="right" w:leader="dot"/>
+        </w:tabs>
+        <w:spacing w:before="0" w:after="40" w:line="240" w:lineRule="auto"/>
+        <w:ind w:left="432"/>
+      </w:pPr>
+      <w:r>
+        <w:rPr>
+          <w:b w:val="0"/>
+          <w:sz w:val="20"/>
+        </w:rPr>
+        <w:t>1.3 Las seis problemáticas, con su causa y su perspectiva</w:t>
+        <w:tab/>
+        <w:t>7</w:t>
+      </w:r>
+    </w:p>
+    <w:p>
+      <w:pPr>
+        <w:tabs>
+          <w:tab w:pos="9360" w:val="right" w:leader="dot"/>
+        </w:tabs>
+        <w:spacing w:before="0" w:after="40" w:line="240" w:lineRule="auto"/>
+        <w:ind w:left="432"/>
+      </w:pPr>
+      <w:r>
+        <w:rPr>
+          <w:b w:val="0"/>
+          <w:sz w:val="20"/>
+        </w:rPr>
+        <w:t>1.4 Lo que el caso dejó pendiente</w:t>
+        <w:tab/>
+        <w:t>8</w:t>
       </w:r>
     </w:p>
     <w:p>
@@ -471,9 +543,9 @@
           <w:b/>
           <w:sz w:val="21"/>
         </w:rPr>
-        <w:t>1. Análisis del caso</w:t>
+        <w:t>2. Investigación de los tópicos relacionados</w:t>
         <w:tab/>
-        <w:t>6</w:t>
+        <w:t>8</w:t>
       </w:r>
     </w:p>
     <w:p>
@@ -489,9 +561,9 @@
           <w:b w:val="0"/>
           <w:sz w:val="20"/>
         </w:rPr>
-        <w:t>1.1 De qué trata</w:t>
+        <w:t>2.1 Los tres sistemas que menciona el caso</w:t>
         <w:tab/>
-        <w:t>6</w:t>
+        <w:t>8</w:t>
       </w:r>
     </w:p>
     <w:p>
@@ -507,9 +579,27 @@
           <w:b w:val="0"/>
           <w:sz w:val="20"/>
         </w:rPr>
-        <w:t>1.2 Involucrados (stakeholders)</w:t>
+        <w:t>2.2 El estacionamiento en la vía pública en Guatemala</w:t>
         <w:tab/>
-        <w:t>7</w:t>
+        <w:t>8</w:t>
+      </w:r>
+    </w:p>
+    <w:p>
+      <w:pPr>
+        <w:tabs>
+          <w:tab w:pos="9360" w:val="right" w:leader="dot"/>
+        </w:tabs>
+        <w:spacing w:before="140" w:after="40" w:line="240" w:lineRule="auto"/>
+        <w:ind w:left="0"/>
+      </w:pPr>
+      <w:r>
+        <w:rPr>
+          <w:b/>
+          <w:sz w:val="21"/>
+        </w:rPr>
+        <w:t>3. Caso de negocio y drivers: los insumos de la arquitectura</w:t>
+        <w:tab/>
+        <w:t>10</w:t>
       </w:r>
     </w:p>
     <w:p>
@@ -525,9 +615,9 @@
           <w:b w:val="0"/>
           <w:sz w:val="20"/>
         </w:rPr>
-        <w:t>1.3 Las seis problemáticas, con su causa y su perspectiva</w:t>
+        <w:t>3.1 Diagrama de contexto</w:t>
         <w:tab/>
-        <w:t>8</w:t>
+        <w:t>10</w:t>
       </w:r>
     </w:p>
     <w:p>
@@ -543,9 +633,81 @@
           <w:b w:val="0"/>
           <w:sz w:val="20"/>
         </w:rPr>
-        <w:t>1.4 Lo que el caso dejó pendiente</w:t>
+        <w:t>3.2 CDU de alto nivel (core) y primera descomposición</w:t>
         <w:tab/>
-        <w:t>8</w:t>
+        <w:t>12</w:t>
+      </w:r>
+    </w:p>
+    <w:p>
+      <w:pPr>
+        <w:tabs>
+          <w:tab w:pos="9360" w:val="right" w:leader="dot"/>
+        </w:tabs>
+        <w:spacing w:before="0" w:after="40" w:line="240" w:lineRule="auto"/>
+        <w:ind w:left="432"/>
+      </w:pPr>
+      <w:r>
+        <w:rPr>
+          <w:b w:val="0"/>
+          <w:sz w:val="20"/>
+        </w:rPr>
+        <w:t>3.3 Drivers funcionales (casos de uso del sistema)</w:t>
+        <w:tab/>
+        <w:t>13</w:t>
+      </w:r>
+    </w:p>
+    <w:p>
+      <w:pPr>
+        <w:tabs>
+          <w:tab w:pos="9360" w:val="right" w:leader="dot"/>
+        </w:tabs>
+        <w:spacing w:before="0" w:after="40" w:line="240" w:lineRule="auto"/>
+        <w:ind w:left="432"/>
+      </w:pPr>
+      <w:r>
+        <w:rPr>
+          <w:b w:val="0"/>
+          <w:sz w:val="20"/>
+        </w:rPr>
+        <w:t>3.4 Drivers de calidad: escenarios de atributos de calidad (EAC)</w:t>
+        <w:tab/>
+        <w:t>21</w:t>
+      </w:r>
+    </w:p>
+    <w:p>
+      <w:pPr>
+        <w:tabs>
+          <w:tab w:pos="9360" w:val="right" w:leader="dot"/>
+        </w:tabs>
+        <w:spacing w:before="0" w:after="40" w:line="240" w:lineRule="auto"/>
+        <w:ind w:left="432"/>
+      </w:pPr>
+      <w:r>
+        <w:rPr>
+          <w:b w:val="0"/>
+          <w:sz w:val="20"/>
+        </w:rPr>
+        <w:t>3.5 Drivers de restricción</w:t>
+        <w:tab/>
+        <w:t>24</w:t>
+      </w:r>
+    </w:p>
+    <w:p>
+      <w:pPr>
+        <w:tabs>
+          <w:tab w:pos="9360" w:val="right" w:leader="dot"/>
+        </w:tabs>
+        <w:spacing w:before="0" w:after="40" w:line="240" w:lineRule="auto"/>
+        <w:ind w:left="432"/>
+      </w:pPr>
+      <w:r>
+        <w:rPr>
+          <w:b w:val="0"/>
+          <w:sz w:val="20"/>
+        </w:rPr>
+        <w:t>3.6 Priorización: los cinco drivers que más pesan</w:t>
+        <w:tab/>
+        <w:t>25</w:t>
       </w:r>
     </w:p>
     <w:p>
@@ -561,9 +723,9 @@
           <w:b/>
           <w:sz w:val="21"/>
         </w:rPr>
-        <w:t>2. Investigación de los tópicos relacionados</w:t>
+        <w:t>4. Posibles soluciones</w:t>
         <w:tab/>
-        <w:t>9</w:t>
+        <w:t>25</w:t>
       </w:r>
     </w:p>
     <w:p>
@@ -579,9 +741,9 @@
           <w:b w:val="0"/>
           <w:sz w:val="20"/>
         </w:rPr>
-        <w:t>2.1 Los tres sistemas que menciona el caso</w:t>
+        <w:t>4.1 Evaluación contra las problemáticas y los drivers</w:t>
         <w:tab/>
-        <w:t>9</w:t>
+        <w:t>26</w:t>
       </w:r>
     </w:p>
     <w:p>
@@ -597,9 +759,9 @@
           <w:b w:val="0"/>
           <w:sz w:val="20"/>
         </w:rPr>
-        <w:t>2.2 El estacionamiento en la vía pública en Guatemala</w:t>
+        <w:t>4.2 La decisión</w:t>
         <w:tab/>
-        <w:t>9</w:t>
+        <w:t>26</w:t>
       </w:r>
     </w:p>
     <w:p>
@@ -615,9 +777,9 @@
           <w:b/>
           <w:sz w:val="21"/>
         </w:rPr>
-        <w:t>3. Caso de negocio y drivers: los insumos de la arquitectura</w:t>
+        <w:t>5. Solución seleccionada: SIEP</w:t>
         <w:tab/>
-        <w:t>10</w:t>
+        <w:t>27</w:t>
       </w:r>
     </w:p>
     <w:p>
@@ -633,9 +795,9 @@
           <w:b w:val="0"/>
           <w:sz w:val="20"/>
         </w:rPr>
-        <w:t>3.1 Diagrama de contexto</w:t>
+        <w:t>5.1 Arquitectura del software</w:t>
         <w:tab/>
-        <w:t>11</w:t>
+        <w:t>27</w:t>
       </w:r>
     </w:p>
     <w:p>
@@ -651,9 +813,9 @@
           <w:b w:val="0"/>
           <w:sz w:val="20"/>
         </w:rPr>
-        <w:t>3.2 CDU de alto nivel (core) y primera descomposición</w:t>
+        <w:t>5.2 Calidad del software</w:t>
         <w:tab/>
-        <w:t>13</w:t>
+        <w:t>33</w:t>
       </w:r>
     </w:p>
     <w:p>
@@ -669,9 +831,9 @@
           <w:b w:val="0"/>
           <w:sz w:val="20"/>
         </w:rPr>
-        <w:t>3.3 Drivers funcionales (casos de uso del sistema)</w:t>
+        <w:t>5.3 Arquitectura en el ciclo de vida</w:t>
         <w:tab/>
-        <w:t>14</w:t>
+        <w:t>34</w:t>
       </w:r>
     </w:p>
     <w:p>
@@ -687,9 +849,9 @@
           <w:b w:val="0"/>
           <w:sz w:val="20"/>
         </w:rPr>
-        <w:t>3.4 Drivers de calidad: escenarios de atributos de calidad (EAC)</w:t>
+        <w:t>5.4 Arquitectura de la información</w:t>
         <w:tab/>
-        <w:t>22</w:t>
+        <w:t>35</w:t>
       </w:r>
     </w:p>
     <w:p>
@@ -705,9 +867,63 @@
           <w:b w:val="0"/>
           <w:sz w:val="20"/>
         </w:rPr>
-        <w:t>3.5 Drivers de restricción</w:t>
+        <w:t>5.5 Factores externos: los cobros de personas ajenas a la municipalidad</w:t>
         <w:tab/>
-        <w:t>25</w:t>
+        <w:t>37</w:t>
+      </w:r>
+    </w:p>
+    <w:p>
+      <w:pPr>
+        <w:tabs>
+          <w:tab w:pos="9360" w:val="right" w:leader="dot"/>
+        </w:tabs>
+        <w:spacing w:before="140" w:after="40" w:line="240" w:lineRule="auto"/>
+        <w:ind w:left="0"/>
+      </w:pPr>
+      <w:r>
+        <w:rPr>
+          <w:b/>
+          <w:sz w:val="21"/>
+        </w:rPr>
+        <w:t>6. Respuestas a las cuestiones del caso</w:t>
+        <w:tab/>
+        <w:t>37</w:t>
+      </w:r>
+    </w:p>
+    <w:p>
+      <w:pPr>
+        <w:tabs>
+          <w:tab w:pos="9360" w:val="right" w:leader="dot"/>
+        </w:tabs>
+        <w:spacing w:before="140" w:after="40" w:line="240" w:lineRule="auto"/>
+        <w:ind w:left="0"/>
+      </w:pPr>
+      <w:r>
+        <w:rPr>
+          <w:b/>
+          <w:sz w:val="21"/>
+        </w:rPr>
+        <w:t>7. Parte desarrollada: prototipo del parquímetro con pago por placa</w:t>
+        <w:tab/>
+        <w:t>41</w:t>
+      </w:r>
+    </w:p>
+    <w:p>
+      <w:pPr>
+        <w:tabs>
+          <w:tab w:pos="9360" w:val="right" w:leader="dot"/>
+        </w:tabs>
+        <w:spacing w:before="140" w:after="40" w:line="240" w:lineRule="auto"/>
+        <w:ind w:left="0"/>
+      </w:pPr>
+      <w:r>
+        <w:rPr>
+          <w:b/>
+          <w:sz w:val="21"/>
+        </w:rPr>
+        <w:t>8. Conclusiones y recomendaciones</w:t>
+        <w:tab/>
+        <w:t>42</w:t>
       </w:r>
     </w:p>
     <w:p>
@@ -723,9 +939,27 @@
           <w:b w:val="0"/>
           <w:sz w:val="20"/>
         </w:rPr>
-        <w:t>3.6 Priorización: los cinco drivers que más pesan</w:t>
+        <w:t>8.1 Conclusiones</w:t>
         <w:tab/>
-        <w:t>26</w:t>
+        <w:t>42</w:t>
+      </w:r>
+    </w:p>
+    <w:p>
+      <w:pPr>
+        <w:tabs>
+          <w:tab w:pos="9360" w:val="right" w:leader="dot"/>
+        </w:tabs>
+        <w:spacing w:before="0" w:after="40" w:line="240" w:lineRule="auto"/>
+        <w:ind w:left="432"/>
+      </w:pPr>
+      <w:r>
+        <w:rPr>
+          <w:b w:val="0"/>
+          <w:sz w:val="20"/>
+        </w:rPr>
+        <w:t>8.2 Recomendaciones</w:t>
+        <w:tab/>
+        <w:t>42</w:t>
       </w:r>
     </w:p>
     <w:p>
@@ -741,45 +975,9 @@
           <w:b/>
           <w:sz w:val="21"/>
         </w:rPr>
-        <w:t>4. Posibles soluciones</w:t>
+        <w:t>9. Supuestos y límites</w:t>
         <w:tab/>
-        <w:t>26</w:t>
-      </w:r>
-    </w:p>
-    <w:p>
-      <w:pPr>
-        <w:tabs>
-          <w:tab w:pos="9360" w:val="right" w:leader="dot"/>
-        </w:tabs>
-        <w:spacing w:before="0" w:after="40" w:line="240" w:lineRule="auto"/>
-        <w:ind w:left="432"/>
-      </w:pPr>
-      <w:r>
-        <w:rPr>
-          <w:b w:val="0"/>
-          <w:sz w:val="20"/>
-        </w:rPr>
-        <w:t>4.1 Evaluación contra las problemáticas y los drivers</w:t>
-        <w:tab/>
-        <w:t>27</w:t>
-      </w:r>
-    </w:p>
-    <w:p>
-      <w:pPr>
-        <w:tabs>
-          <w:tab w:pos="9360" w:val="right" w:leader="dot"/>
-        </w:tabs>
-        <w:spacing w:before="0" w:after="40" w:line="240" w:lineRule="auto"/>
-        <w:ind w:left="432"/>
-      </w:pPr>
-      <w:r>
-        <w:rPr>
-          <w:b w:val="0"/>
-          <w:sz w:val="20"/>
-        </w:rPr>
-        <w:t>4.2 La decisión</w:t>
-        <w:tab/>
-        <w:t>27</w:t>
+        <w:t>42</w:t>
       </w:r>
     </w:p>
     <w:p>
@@ -795,225 +993,9 @@
           <w:b/>
           <w:sz w:val="21"/>
         </w:rPr>
-        <w:t>5. Solución seleccionada: SIEP</w:t>
-        <w:tab/>
-        <w:t>28</w:t>
-      </w:r>
-    </w:p>
-    <w:p>
-      <w:pPr>
-        <w:tabs>
-          <w:tab w:pos="9360" w:val="right" w:leader="dot"/>
-        </w:tabs>
-        <w:spacing w:before="0" w:after="40" w:line="240" w:lineRule="auto"/>
-        <w:ind w:left="432"/>
-      </w:pPr>
-      <w:r>
-        <w:rPr>
-          <w:b w:val="0"/>
-          <w:sz w:val="20"/>
-        </w:rPr>
-        <w:t>5.1 Arquitectura del software</w:t>
-        <w:tab/>
-        <w:t>28</w:t>
-      </w:r>
-    </w:p>
-    <w:p>
-      <w:pPr>
-        <w:tabs>
-          <w:tab w:pos="9360" w:val="right" w:leader="dot"/>
-        </w:tabs>
-        <w:spacing w:before="0" w:after="40" w:line="240" w:lineRule="auto"/>
-        <w:ind w:left="432"/>
-      </w:pPr>
-      <w:r>
-        <w:rPr>
-          <w:b w:val="0"/>
-          <w:sz w:val="20"/>
-        </w:rPr>
-        <w:t>5.2 Calidad del software</w:t>
-        <w:tab/>
-        <w:t>34</w:t>
-      </w:r>
-    </w:p>
-    <w:p>
-      <w:pPr>
-        <w:tabs>
-          <w:tab w:pos="9360" w:val="right" w:leader="dot"/>
-        </w:tabs>
-        <w:spacing w:before="0" w:after="40" w:line="240" w:lineRule="auto"/>
-        <w:ind w:left="432"/>
-      </w:pPr>
-      <w:r>
-        <w:rPr>
-          <w:b w:val="0"/>
-          <w:sz w:val="20"/>
-        </w:rPr>
-        <w:t>5.3 Arquitectura en el ciclo de vida</w:t>
-        <w:tab/>
-        <w:t>35</w:t>
-      </w:r>
-    </w:p>
-    <w:p>
-      <w:pPr>
-        <w:tabs>
-          <w:tab w:pos="9360" w:val="right" w:leader="dot"/>
-        </w:tabs>
-        <w:spacing w:before="0" w:after="40" w:line="240" w:lineRule="auto"/>
-        <w:ind w:left="432"/>
-      </w:pPr>
-      <w:r>
-        <w:rPr>
-          <w:b w:val="0"/>
-          <w:sz w:val="20"/>
-        </w:rPr>
-        <w:t>5.4 Arquitectura de la información</w:t>
-        <w:tab/>
-        <w:t>36</w:t>
-      </w:r>
-    </w:p>
-    <w:p>
-      <w:pPr>
-        <w:tabs>
-          <w:tab w:pos="9360" w:val="right" w:leader="dot"/>
-        </w:tabs>
-        <w:spacing w:before="0" w:after="40" w:line="240" w:lineRule="auto"/>
-        <w:ind w:left="432"/>
-      </w:pPr>
-      <w:r>
-        <w:rPr>
-          <w:b w:val="0"/>
-          <w:sz w:val="20"/>
-        </w:rPr>
-        <w:t>5.5 Factores externos: los cobros de personas ajenas a la municipalidad</w:t>
-        <w:tab/>
-        <w:t>38</w:t>
-      </w:r>
-    </w:p>
-    <w:p>
-      <w:pPr>
-        <w:tabs>
-          <w:tab w:pos="9360" w:val="right" w:leader="dot"/>
-        </w:tabs>
-        <w:spacing w:before="140" w:after="40" w:line="240" w:lineRule="auto"/>
-        <w:ind w:left="0"/>
-      </w:pPr>
-      <w:r>
-        <w:rPr>
-          <w:b/>
-          <w:sz w:val="21"/>
-        </w:rPr>
-        <w:t>6. Respuestas a las cuestiones del caso</w:t>
-        <w:tab/>
-        <w:t>38</w:t>
-      </w:r>
-    </w:p>
-    <w:p>
-      <w:pPr>
-        <w:tabs>
-          <w:tab w:pos="9360" w:val="right" w:leader="dot"/>
-        </w:tabs>
-        <w:spacing w:before="140" w:after="40" w:line="240" w:lineRule="auto"/>
-        <w:ind w:left="0"/>
-      </w:pPr>
-      <w:r>
-        <w:rPr>
-          <w:b/>
-          <w:sz w:val="21"/>
-        </w:rPr>
-        <w:t>7. Parte desarrollada: prototipo del parquímetro con pago por placa</w:t>
-        <w:tab/>
-        <w:t>42</w:t>
-      </w:r>
-    </w:p>
-    <w:p>
-      <w:pPr>
-        <w:tabs>
-          <w:tab w:pos="9360" w:val="right" w:leader="dot"/>
-        </w:tabs>
-        <w:spacing w:before="140" w:after="40" w:line="240" w:lineRule="auto"/>
-        <w:ind w:left="0"/>
-      </w:pPr>
-      <w:r>
-        <w:rPr>
-          <w:b/>
-          <w:sz w:val="21"/>
-        </w:rPr>
-        <w:t>8. Conclusiones y recomendaciones</w:t>
+        <w:t>10. Referencias</w:t>
         <w:tab/>
         <w:t>43</w:t>
-      </w:r>
-    </w:p>
-    <w:p>
-      <w:pPr>
-        <w:tabs>
-          <w:tab w:pos="9360" w:val="right" w:leader="dot"/>
-        </w:tabs>
-        <w:spacing w:before="0" w:after="40" w:line="240" w:lineRule="auto"/>
-        <w:ind w:left="432"/>
-      </w:pPr>
-      <w:r>
-        <w:rPr>
-          <w:b w:val="0"/>
-          <w:sz w:val="20"/>
-        </w:rPr>
-        <w:t>8.1 Conclusiones</w:t>
-        <w:tab/>
-        <w:t>43</w:t>
-      </w:r>
-    </w:p>
-    <w:p>
-      <w:pPr>
-        <w:tabs>
-          <w:tab w:pos="9360" w:val="right" w:leader="dot"/>
-        </w:tabs>
-        <w:spacing w:before="0" w:after="40" w:line="240" w:lineRule="auto"/>
-        <w:ind w:left="432"/>
-      </w:pPr>
-      <w:r>
-        <w:rPr>
-          <w:b w:val="0"/>
-          <w:sz w:val="20"/>
-        </w:rPr>
-        <w:t>8.2 Recomendaciones</w:t>
-        <w:tab/>
-        <w:t>43</w:t>
-      </w:r>
-    </w:p>
-    <w:p>
-      <w:pPr>
-        <w:tabs>
-          <w:tab w:pos="9360" w:val="right" w:leader="dot"/>
-        </w:tabs>
-        <w:spacing w:before="140" w:after="40" w:line="240" w:lineRule="auto"/>
-        <w:ind w:left="0"/>
-      </w:pPr>
-      <w:r>
-        <w:rPr>
-          <w:b/>
-          <w:sz w:val="21"/>
-        </w:rPr>
-        <w:t>9. Supuestos y límites</w:t>
-        <w:tab/>
-        <w:t>43</w:t>
-      </w:r>
-    </w:p>
-    <w:p>
-      <w:pPr>
-        <w:tabs>
-          <w:tab w:pos="9360" w:val="right" w:leader="dot"/>
-        </w:tabs>
-        <w:spacing w:before="140" w:after="40" w:line="240" w:lineRule="auto"/>
-        <w:ind w:left="0"/>
-      </w:pPr>
-      <w:r>
-        <w:rPr>
-          <w:b/>
-          <w:sz w:val="21"/>
-        </w:rPr>
-        <w:t>10. Referencias</w:t>
-        <w:tab/>
-        <w:t>44</w:t>
       </w:r>
     </w:p>
     <w:p>
@@ -1553,7 +1535,7 @@
           <w:i w:val="0"/>
           <w:color w:val="000000"/>
         </w:rPr>
-        <w:t>Equipo y correspondencia con la consigna</w:t>
+        <w:t>Equipo de trabajo</w:t>
       </w:r>
     </w:p>
     <w:tbl>
@@ -1912,35 +1894,6 @@
     </w:p>
     <w:p>
       <w:pPr>
-        <w:keepNext w:val="0"/>
-      </w:pPr>
-      <w:r>
-        <w:rPr>
-          <w:b w:val="0"/>
-          <w:i w:val="0"/>
-          <w:sz w:val="22"/>
-        </w:rPr>
-        <w:t xml:space="preserve">El trabajo se versionó con </w:t>
-      </w:r>
-      <w:r>
-        <w:rPr>
-          <w:b/>
-          <w:i w:val="0"/>
-          <w:sz w:val="22"/>
-        </w:rPr>
-        <w:t>GitFlow</w:t>
-      </w:r>
-      <w:r>
-        <w:rPr>
-          <w:b w:val="0"/>
-          <w:i w:val="0"/>
-          <w:sz w:val="22"/>
-        </w:rPr>
-        <w:t xml:space="preserve"> en el repositorio github.com/Santiago78op/Dise-o-Arquitectonico-los-Parqu-metros: una rama por entregable (documento, presentación y sitio), integradas en develop y publicadas en main con una versión etiquetada.</w:t>
-      </w:r>
-    </w:p>
-    <w:p>
-      <w:pPr>
         <w:pStyle w:val="Heading2"/>
       </w:pPr>
       <w:r>
@@ -1954,395 +1907,7 @@
           <w:i w:val="0"/>
           <w:color w:val="000000"/>
         </w:rPr>
-        <w:t>Qué pide la consigna y dónde está</w:t>
-      </w:r>
-    </w:p>
-    <w:tbl>
-      <w:tblPr>
-        <w:tblStyle w:val="TableGrid"/>
-        <w:jc w:val="center"/>
-        <w:tblLayout w:type="fixed"/>
-        <w:tblLook w:firstColumn="1" w:firstRow="1" w:lastColumn="0" w:lastRow="0" w:noHBand="0" w:noVBand="1" w:val="04A0"/>
-        <w:tblCellMar>
-          <w:top w:w="50" w:type="dxa"/>
-          <w:left w:w="100" w:type="dxa"/>
-          <w:bottom w:w="50" w:type="dxa"/>
-          <w:right w:w="100" w:type="dxa"/>
-        </w:tblCellMar>
-        <w:tblW w:type="dxa" w:w="9360"/>
-      </w:tblPr>
-      <w:tblGrid>
-        <w:gridCol w:w="5148"/>
-        <w:gridCol w:w="4212"/>
-      </w:tblGrid>
-      <w:tr>
-        <w:trPr>
-          <w:tblHeader w:val="true"/>
-        </w:trPr>
-        <w:tc>
-          <w:tcPr>
-            <w:tcW w:type="dxa" w:w="5148"/>
-            <w:shd w:val="clear" w:color="auto" w:fill="EDEFF2"/>
-          </w:tcPr>
-          <w:p>
-            <w:pPr>
-              <w:keepNext/>
-              <w:spacing w:after="20"/>
-            </w:pPr>
-            <w:r>
-              <w:rPr>
-                <w:b/>
-                <w:i w:val="0"/>
-                <w:sz w:val="19"/>
-              </w:rPr>
-              <w:t>Lo que pide la consigna</w:t>
-            </w:r>
-          </w:p>
-        </w:tc>
-        <w:tc>
-          <w:tcPr>
-            <w:tcW w:type="dxa" w:w="4212"/>
-            <w:shd w:val="clear" w:color="auto" w:fill="EDEFF2"/>
-          </w:tcPr>
-          <w:p>
-            <w:pPr>
-              <w:keepNext/>
-              <w:spacing w:after="20"/>
-            </w:pPr>
-            <w:r>
-              <w:rPr>
-                <w:b/>
-                <w:i w:val="0"/>
-                <w:sz w:val="19"/>
-              </w:rPr>
-              <w:t>Dónde está</w:t>
-            </w:r>
-          </w:p>
-        </w:tc>
-      </w:tr>
-      <w:tr>
-        <w:trPr>
-          <w:cantSplit/>
-        </w:trPr>
-        <w:tc>
-          <w:tcPr>
-            <w:tcW w:type="dxa" w:w="5148"/>
-          </w:tcPr>
-          <w:p>
-            <w:pPr>
-              <w:keepNext/>
-              <w:spacing w:after="20"/>
-            </w:pPr>
-            <w:r>
-              <w:rPr>
-                <w:b w:val="0"/>
-                <w:i w:val="0"/>
-                <w:sz w:val="19"/>
-              </w:rPr>
-              <w:t>Estudio y análisis del caso</w:t>
-            </w:r>
-          </w:p>
-        </w:tc>
-        <w:tc>
-          <w:tcPr>
-            <w:tcW w:type="dxa" w:w="4212"/>
-          </w:tcPr>
-          <w:p>
-            <w:pPr>
-              <w:keepNext/>
-              <w:spacing w:after="20"/>
-            </w:pPr>
-            <w:r>
-              <w:rPr>
-                <w:b w:val="0"/>
-                <w:i w:val="0"/>
-                <w:sz w:val="19"/>
-              </w:rPr>
-              <w:t>§1 Análisis del caso</w:t>
-            </w:r>
-          </w:p>
-        </w:tc>
-      </w:tr>
-      <w:tr>
-        <w:trPr>
-          <w:cantSplit/>
-        </w:trPr>
-        <w:tc>
-          <w:tcPr>
-            <w:tcW w:type="dxa" w:w="5148"/>
-          </w:tcPr>
-          <w:p>
-            <w:pPr>
-              <w:keepNext/>
-              <w:spacing w:after="20"/>
-            </w:pPr>
-            <w:r>
-              <w:rPr>
-                <w:b w:val="0"/>
-                <w:i w:val="0"/>
-                <w:sz w:val="19"/>
-              </w:rPr>
-              <w:t>Investigación de los tópicos relacionados</w:t>
-            </w:r>
-          </w:p>
-        </w:tc>
-        <w:tc>
-          <w:tcPr>
-            <w:tcW w:type="dxa" w:w="4212"/>
-          </w:tcPr>
-          <w:p>
-            <w:pPr>
-              <w:keepNext/>
-              <w:spacing w:after="20"/>
-            </w:pPr>
-            <w:r>
-              <w:rPr>
-                <w:b w:val="0"/>
-                <w:i w:val="0"/>
-                <w:sz w:val="19"/>
-              </w:rPr>
-              <w:t>§2 Investigación: sistemas de referencia y el estacionamiento en Guatemala</w:t>
-            </w:r>
-          </w:p>
-        </w:tc>
-      </w:tr>
-      <w:tr>
-        <w:trPr>
-          <w:cantSplit/>
-        </w:trPr>
-        <w:tc>
-          <w:tcPr>
-            <w:tcW w:type="dxa" w:w="5148"/>
-          </w:tcPr>
-          <w:p>
-            <w:pPr>
-              <w:keepNext w:val="0"/>
-              <w:spacing w:after="20"/>
-            </w:pPr>
-            <w:r>
-              <w:rPr>
-                <w:b w:val="0"/>
-                <w:i w:val="0"/>
-                <w:sz w:val="19"/>
-              </w:rPr>
-              <w:t>Posibles soluciones desde la arquitectura del software, la calidad, la arquitectura en el ciclo de vida y la arquitectura de la información</w:t>
-            </w:r>
-          </w:p>
-        </w:tc>
-        <w:tc>
-          <w:tcPr>
-            <w:tcW w:type="dxa" w:w="4212"/>
-          </w:tcPr>
-          <w:p>
-            <w:pPr>
-              <w:keepNext w:val="0"/>
-              <w:spacing w:after="20"/>
-            </w:pPr>
-            <w:r>
-              <w:rPr>
-                <w:b w:val="0"/>
-                <w:i w:val="0"/>
-                <w:sz w:val="19"/>
-              </w:rPr>
-              <w:t>§3 Caso de negocio y drivers (los insumos) · §4 Posibles soluciones, evaluadas en las cuatro perspectivas</w:t>
-            </w:r>
-          </w:p>
-        </w:tc>
-      </w:tr>
-      <w:tr>
-        <w:trPr>
-          <w:cantSplit/>
-        </w:trPr>
-        <w:tc>
-          <w:tcPr>
-            <w:tcW w:type="dxa" w:w="5148"/>
-          </w:tcPr>
-          <w:p>
-            <w:pPr>
-              <w:keepNext w:val="0"/>
-              <w:spacing w:after="20"/>
-            </w:pPr>
-            <w:r>
-              <w:rPr>
-                <w:b w:val="0"/>
-                <w:i w:val="0"/>
-                <w:sz w:val="19"/>
-              </w:rPr>
-              <w:t>Solución seleccionada, debidamente justificada</w:t>
-            </w:r>
-          </w:p>
-        </w:tc>
-        <w:tc>
-          <w:tcPr>
-            <w:tcW w:type="dxa" w:w="4212"/>
-          </w:tcPr>
-          <w:p>
-            <w:pPr>
-              <w:keepNext w:val="0"/>
-              <w:spacing w:after="20"/>
-            </w:pPr>
-            <w:r>
-              <w:rPr>
-                <w:b w:val="0"/>
-                <w:i w:val="0"/>
-                <w:sz w:val="19"/>
-              </w:rPr>
-              <w:t>§5 (5.1 arquitectura del software · 5.2 calidad · 5.3 ciclo de vida · 5.4 arquitectura de la información · 5.5 factores externos: los cobros informales)</w:t>
-            </w:r>
-          </w:p>
-        </w:tc>
-      </w:tr>
-      <w:tr>
-        <w:trPr>
-          <w:cantSplit/>
-        </w:trPr>
-        <w:tc>
-          <w:tcPr>
-            <w:tcW w:type="dxa" w:w="5148"/>
-          </w:tcPr>
-          <w:p>
-            <w:pPr>
-              <w:keepNext w:val="0"/>
-              <w:spacing w:after="20"/>
-            </w:pPr>
-            <w:r>
-              <w:rPr>
-                <w:b w:val="0"/>
-                <w:i w:val="0"/>
-                <w:sz w:val="19"/>
-              </w:rPr>
-              <w:t>Respuestas a las cuestiones que presenta el caso</w:t>
-            </w:r>
-          </w:p>
-        </w:tc>
-        <w:tc>
-          <w:tcPr>
-            <w:tcW w:type="dxa" w:w="4212"/>
-          </w:tcPr>
-          <w:p>
-            <w:pPr>
-              <w:keepNext w:val="0"/>
-              <w:spacing w:after="20"/>
-            </w:pPr>
-            <w:r>
-              <w:rPr>
-                <w:b w:val="0"/>
-                <w:i w:val="0"/>
-                <w:sz w:val="19"/>
-              </w:rPr>
-              <w:t>§6 Las 14 preguntas del caso</w:t>
-            </w:r>
-          </w:p>
-        </w:tc>
-      </w:tr>
-      <w:tr>
-        <w:trPr>
-          <w:cantSplit/>
-        </w:trPr>
-        <w:tc>
-          <w:tcPr>
-            <w:tcW w:type="dxa" w:w="5148"/>
-          </w:tcPr>
-          <w:p>
-            <w:pPr>
-              <w:keepNext w:val="0"/>
-              <w:spacing w:after="20"/>
-            </w:pPr>
-            <w:r>
-              <w:rPr>
-                <w:b w:val="0"/>
-                <w:i w:val="0"/>
-                <w:sz w:val="19"/>
-              </w:rPr>
-              <w:t>Desarrollo de una parte del sistema, según la arquitectura elegida</w:t>
-            </w:r>
-          </w:p>
-        </w:tc>
-        <w:tc>
-          <w:tcPr>
-            <w:tcW w:type="dxa" w:w="4212"/>
-          </w:tcPr>
-          <w:p>
-            <w:pPr>
-              <w:keepNext w:val="0"/>
-              <w:spacing w:after="20"/>
-            </w:pPr>
-            <w:r>
-              <w:rPr>
-                <w:b w:val="0"/>
-                <w:i w:val="0"/>
-                <w:sz w:val="19"/>
-              </w:rPr>
-              <w:t>§7 Prototipo del parquímetro con pago por placa</w:t>
-            </w:r>
-          </w:p>
-        </w:tc>
-      </w:tr>
-      <w:tr>
-        <w:trPr>
-          <w:cantSplit/>
-        </w:trPr>
-        <w:tc>
-          <w:tcPr>
-            <w:tcW w:type="dxa" w:w="5148"/>
-          </w:tcPr>
-          <w:p>
-            <w:pPr>
-              <w:keepNext w:val="0"/>
-              <w:spacing w:after="20"/>
-            </w:pPr>
-            <w:r>
-              <w:rPr>
-                <w:b w:val="0"/>
-                <w:i w:val="0"/>
-                <w:sz w:val="19"/>
-              </w:rPr>
-              <w:t>Supuestos, límites y fuentes</w:t>
-            </w:r>
-          </w:p>
-        </w:tc>
-        <w:tc>
-          <w:tcPr>
-            <w:tcW w:type="dxa" w:w="4212"/>
-          </w:tcPr>
-          <w:p>
-            <w:pPr>
-              <w:keepNext w:val="0"/>
-              <w:spacing w:after="20"/>
-            </w:pPr>
-            <w:r>
-              <w:rPr>
-                <w:b w:val="0"/>
-                <w:i w:val="0"/>
-                <w:sz w:val="19"/>
-              </w:rPr>
-              <w:t>§8 y §9 · al inicio, «Palabras que usamos»</w:t>
-            </w:r>
-          </w:p>
-        </w:tc>
-      </w:tr>
-    </w:tbl>
-    <w:p>
-      <w:pPr>
-        <w:spacing w:after="40"/>
-      </w:pPr>
-    </w:p>
-    <w:p>
-      <w:pPr>
-        <w:pStyle w:val="Heading2"/>
-      </w:pPr>
-      <w:r>
-        <w:rPr>
-          <w:color w:val="000000"/>
-        </w:rPr>
-      </w:r>
-      <w:r>
-        <w:rPr>
-          <w:b/>
-          <w:i w:val="0"/>
-          <w:color w:val="000000"/>
-        </w:rPr>
-        <w:t>Declaraciones que condicionan todo el documento</w:t>
+        <w:t>Alcance del análisis</w:t>
       </w:r>
     </w:p>
     <w:p>
@@ -2356,7 +1921,7 @@
           <w:i w:val="0"/>
           <w:sz w:val="20"/>
         </w:rPr>
-        <w:t>Frontera del negocio</w:t>
+        <w:t>El negocio que se modela</w:t>
       </w:r>
     </w:p>
     <w:p>
@@ -2458,11 +2023,19 @@
       </w:pPr>
       <w:r>
         <w:rPr>
+          <w:b w:val="0"/>
+          <w:i w:val="0"/>
+          <w:sz w:val="19"/>
+        </w:rPr>
+        <w:t xml:space="preserve">Frente al </w:t>
+      </w:r>
+      <w:r>
+        <w:rPr>
           <w:b/>
           <w:i w:val="0"/>
           <w:sz w:val="19"/>
         </w:rPr>
-        <w:t>Cambio de lente:</w:t>
+        <w:t>software</w:t>
       </w:r>
       <w:r>
         <w:rPr>
@@ -2470,23 +2043,7 @@
           <w:i w:val="0"/>
           <w:sz w:val="19"/>
         </w:rPr>
-        <w:t xml:space="preserve"> frente al </w:t>
-      </w:r>
-      <w:r>
-        <w:rPr>
-          <w:b/>
-          <w:i w:val="0"/>
-          <w:sz w:val="19"/>
-        </w:rPr>
-        <w:t>software</w:t>
-      </w:r>
-      <w:r>
-        <w:rPr>
-          <w:b w:val="0"/>
-          <w:i w:val="0"/>
-          <w:sz w:val="19"/>
-        </w:rPr>
-        <w:t>, el verificador deja de ser trabajador y pasa a ser una entidad que usa el sistema. Por eso no está en el core (§3.2) y sí en el contexto (§3.1) y en los CDU expandidos (§3.3).</w:t>
+        <w:t>, en cambio, el verificador deja de ser trabajador y pasa a ser una entidad que usa el sistema. Por eso no está en el core (§3.2) y sí en el contexto (§3.1) y en los CDU expandidos (§3.3).</w:t>
       </w:r>
     </w:p>
     <w:p>
@@ -2529,104 +2086,23 @@
     </w:p>
     <w:p>
       <w:pPr>
-        <w:spacing w:after="60"/>
-        <w:ind w:left="432"/>
+        <w:keepNext w:val="0"/>
       </w:pPr>
       <w:r>
         <w:rPr>
           <w:b/>
           <w:i w:val="0"/>
-          <w:sz w:val="20"/>
-        </w:rPr>
-        <w:t>Cómo se leyó la consigna</w:t>
-      </w:r>
-    </w:p>
-    <w:p>
-      <w:pPr>
-        <w:spacing w:after="60"/>
-        <w:ind w:left="432"/>
-      </w:pPr>
-      <w:r>
-        <w:rPr>
-          <w:b/>
-          <w:i w:val="0"/>
-          <w:sz w:val="19"/>
-        </w:rPr>
-        <w:t>Las cuatro perspectivas</w:t>
+          <w:sz w:val="22"/>
+        </w:rPr>
+        <w:t>SIEP</w:t>
       </w:r>
       <w:r>
         <w:rPr>
           <w:b w:val="0"/>
           <w:i w:val="0"/>
-          <w:sz w:val="19"/>
-        </w:rPr>
-        <w:t xml:space="preserve"> se aplican a cada alternativa (§4) y organizan la solución elegida (§5): arquitectura del software, calidad del software, arquitectura en el ciclo de vida y arquitectura de la información.</w:t>
-      </w:r>
-    </w:p>
-    <w:p>
-      <w:pPr>
-        <w:spacing w:after="60"/>
-        <w:ind w:left="432"/>
-      </w:pPr>
-      <w:r>
-        <w:rPr>
-          <w:b/>
-          <w:i w:val="0"/>
-          <w:sz w:val="19"/>
-        </w:rPr>
-        <w:t>El caso ocurre en la Ciudad de México en 2012.</w:t>
-      </w:r>
-      <w:r>
-        <w:rPr>
-          <w:b w:val="0"/>
-          <w:i w:val="0"/>
-          <w:sz w:val="19"/>
-        </w:rPr>
-        <w:t xml:space="preserve"> La solución se diseña para SERVIparq, y en cada decisión se indica cómo se trasladaría a una municipalidad guatemalteca, con los hechos del §2.2.</w:t>
-      </w:r>
-    </w:p>
-    <w:p>
-      <w:pPr>
-        <w:spacing w:after="60"/>
-        <w:ind w:left="432"/>
-      </w:pPr>
-      <w:r>
-        <w:rPr>
-          <w:b/>
-          <w:i w:val="0"/>
-          <w:sz w:val="19"/>
-        </w:rPr>
-        <w:t>Identificadores:</w:t>
-      </w:r>
-      <w:r>
-        <w:rPr>
-          <w:b w:val="0"/>
-          <w:i w:val="0"/>
-          <w:sz w:val="19"/>
-        </w:rPr>
-        <w:t xml:space="preserve"> STK-nn stakeholder · P-nn problemática del diagnóstico · CDU-nn proceso de negocio · CU-nn caso de uso del sistema · EAC-nn escenario de atributo de calidad · RE-nn restricción · S-n alternativa de solución.</w:t>
-      </w:r>
-    </w:p>
-    <w:p>
-      <w:pPr>
-        <w:spacing w:after="200"/>
-        <w:ind w:left="432"/>
-      </w:pPr>
-      <w:r>
-        <w:rPr>
-          <w:b/>
-          <w:i w:val="0"/>
-          <w:sz w:val="19"/>
-        </w:rPr>
-        <w:t>Nombre de la solución:</w:t>
-      </w:r>
-      <w:r>
-        <w:rPr>
-          <w:b w:val="0"/>
-          <w:i w:val="0"/>
-          <w:sz w:val="19"/>
-        </w:rPr>
-        <w:t xml:space="preserve"> SIEP, Sistema Integrado de Estacionamiento en la vía Pública.</w:t>
+          <w:sz w:val="22"/>
+        </w:rPr>
+        <w:t xml:space="preserve"> (Sistema Integrado de Estacionamiento en la vía Pública) es el nombre de la solución. El caso ocurre en la Ciudad de México en 2012; en cada decisión se indica cómo se aplicaría en una municipalidad guatemalteca. Los identificadores usados son: STK-nn involucrado, P-nn problemática, CDU-nn proceso de negocio, CU-nn caso de uso del sistema, EAC-nn escenario de calidad, RE-nn restricción y S-n alternativa de solución.</w:t>
       </w:r>
     </w:p>
     <w:p>
@@ -3465,7 +2941,7 @@
           <w:i w:val="0"/>
           <w:sz w:val="22"/>
         </w:rPr>
-        <w:t>La lectura que guía este documento:</w:t>
+        <w:t>Nuestra lectura del caso:</w:t>
       </w:r>
       <w:r>
         <w:rPr>
@@ -6833,7 +6309,7 @@
                 <w:i w:val="0"/>
                 <w:sz w:val="18"/>
               </w:rPr>
-              <w:t>La misma combinación que propone este documento: canal digital sin dejar fuera a quien no tiene teléfono</w:t>
+              <w:t>La misma combinación que proponemos: canal digital sin dejar fuera a quien no tiene teléfono</w:t>
             </w:r>
           </w:p>
         </w:tc>
@@ -6862,72 +6338,6 @@
       <w:pPr>
         <w:spacing w:after="40"/>
       </w:pPr>
-    </w:p>
-    <w:p>
-      <w:pPr>
-        <w:pStyle w:val="Heading1"/>
-        <w:pBdr>
-          <w:bottom w:val="single" w:sz="6" w:space="4" w:color="9AA0A6"/>
-        </w:pBdr>
-      </w:pPr>
-      <w:r>
-        <w:rPr>
-          <w:color w:val="000000"/>
-        </w:rPr>
-      </w:r>
-      <w:r>
-        <w:rPr>
-          <w:b/>
-          <w:i w:val="0"/>
-          <w:color w:val="000000"/>
-        </w:rPr>
-        <w:t>3. Caso de negocio y drivers: los insumos de la arquitectura</w:t>
-      </w:r>
-    </w:p>
-    <w:p>
-      <w:pPr>
-        <w:keepNext w:val="0"/>
-      </w:pPr>
-      <w:r>
-        <w:rPr>
-          <w:b w:val="0"/>
-          <w:i w:val="0"/>
-          <w:sz w:val="22"/>
-        </w:rPr>
-        <w:t xml:space="preserve">Antes de proponer una solución se delimita el negocio (el </w:t>
-      </w:r>
-      <w:r>
-        <w:rPr>
-          <w:b/>
-          <w:i w:val="0"/>
-          <w:sz w:val="22"/>
-        </w:rPr>
-        <w:t>paso 0</w:t>
-      </w:r>
-      <w:r>
-        <w:rPr>
-          <w:b w:val="0"/>
-          <w:i w:val="0"/>
-          <w:sz w:val="22"/>
-        </w:rPr>
-        <w:t xml:space="preserve"> del método de clase) y se identifican los </w:t>
-      </w:r>
-      <w:r>
-        <w:rPr>
-          <w:b/>
-          <w:i w:val="0"/>
-          <w:sz w:val="22"/>
-        </w:rPr>
-        <w:t>drivers arquitectónicos</w:t>
-      </w:r>
-      <w:r>
-        <w:rPr>
-          <w:b w:val="0"/>
-          <w:i w:val="0"/>
-          <w:sz w:val="22"/>
-        </w:rPr>
-        <w:t>: los factores críticos que guían el diseño, en sus tres tipos de clase: funcionales (casos de uso), de calidad (escenarios con medida) y de restricción (condiciones impuestas desde afuera).</w:t>
-      </w:r>
     </w:p>
     <w:p>
       <w:pPr>
@@ -6942,6 +6352,72 @@
     </w:p>
     <w:p>
       <w:pPr>
+        <w:pStyle w:val="Heading1"/>
+        <w:pBdr>
+          <w:bottom w:val="single" w:sz="6" w:space="4" w:color="9AA0A6"/>
+        </w:pBdr>
+      </w:pPr>
+      <w:r>
+        <w:rPr>
+          <w:color w:val="000000"/>
+        </w:rPr>
+      </w:r>
+      <w:r>
+        <w:rPr>
+          <w:b/>
+          <w:i w:val="0"/>
+          <w:color w:val="000000"/>
+        </w:rPr>
+        <w:t>3. Caso de negocio y drivers: los insumos de la arquitectura</w:t>
+      </w:r>
+    </w:p>
+    <w:p>
+      <w:pPr>
+        <w:keepNext w:val="0"/>
+      </w:pPr>
+      <w:r>
+        <w:rPr>
+          <w:b w:val="0"/>
+          <w:i w:val="0"/>
+          <w:sz w:val="22"/>
+        </w:rPr>
+        <w:t xml:space="preserve">Antes de proponer una solución se delimita el negocio (el </w:t>
+      </w:r>
+      <w:r>
+        <w:rPr>
+          <w:b/>
+          <w:i w:val="0"/>
+          <w:sz w:val="22"/>
+        </w:rPr>
+        <w:t>paso 0</w:t>
+      </w:r>
+      <w:r>
+        <w:rPr>
+          <w:b w:val="0"/>
+          <w:i w:val="0"/>
+          <w:sz w:val="22"/>
+        </w:rPr>
+        <w:t xml:space="preserve"> del método de clase) y se identifican los </w:t>
+      </w:r>
+      <w:r>
+        <w:rPr>
+          <w:b/>
+          <w:i w:val="0"/>
+          <w:sz w:val="22"/>
+        </w:rPr>
+        <w:t>drivers arquitectónicos</w:t>
+      </w:r>
+      <w:r>
+        <w:rPr>
+          <w:b w:val="0"/>
+          <w:i w:val="0"/>
+          <w:sz w:val="22"/>
+        </w:rPr>
+        <w:t>: los factores críticos que guían el diseño, en sus tres tipos de clase: funcionales (casos de uso), de calidad (escenarios con medida) y de restricción (condiciones impuestas desde afuera).</w:t>
+      </w:r>
+    </w:p>
+    <w:p>
+      <w:pPr>
         <w:pStyle w:val="Heading2"/>
       </w:pPr>
       <w:r>
@@ -7035,7 +6511,7 @@
       <w:r>
         <w:drawing>
           <wp:inline xmlns:a="http://schemas.openxmlformats.org/drawingml/2006/main" xmlns:pic="http://schemas.openxmlformats.org/drawingml/2006/picture">
-            <wp:extent cx="6675120" cy="4457497"/>
+            <wp:extent cx="5852160" cy="3907942"/>
             <wp:docPr id="2" name="Picture 2"/>
             <wp:cNvGraphicFramePr>
               <a:graphicFrameLocks noChangeAspect="1"/>
@@ -7056,7 +6532,7 @@
                   <pic:spPr>
                     <a:xfrm>
                       <a:off x="0" y="0"/>
-                      <a:ext cx="6675120" cy="4457497"/>
+                      <a:ext cx="5852160" cy="3907942"/>
                     </a:xfrm>
                     <a:prstGeom prst="rect"/>
                   </pic:spPr>
@@ -16005,138 +15481,15 @@
     </w:p>
     <w:p>
       <w:pPr>
-        <w:spacing w:after="60"/>
-        <w:ind w:left="432"/>
-      </w:pPr>
-      <w:r>
-        <w:rPr>
-          <w:b/>
-          <w:i w:val="0"/>
-          <w:sz w:val="20"/>
-        </w:rPr>
-        <w:t>Qué taxonomía se usa</w:t>
-      </w:r>
-    </w:p>
-    <w:p>
-      <w:pPr>
-        <w:spacing w:after="60"/>
-        <w:ind w:left="432"/>
+        <w:keepNext w:val="0"/>
       </w:pPr>
       <w:r>
         <w:rPr>
           <w:b w:val="0"/>
           <w:i w:val="0"/>
-          <w:sz w:val="19"/>
-        </w:rPr>
-        <w:t xml:space="preserve">La </w:t>
-      </w:r>
-      <w:r>
-        <w:rPr>
-          <w:b/>
-          <w:i w:val="0"/>
-          <w:sz w:val="19"/>
-        </w:rPr>
-        <w:t>categoría</w:t>
-      </w:r>
-      <w:r>
-        <w:rPr>
-          <w:b w:val="0"/>
-          <w:i w:val="0"/>
-          <w:sz w:val="19"/>
-        </w:rPr>
-        <w:t xml:space="preserve"> es la de la lista de drivers de calidad de clase (rendimiento, escalabilidad, disponibilidad, seguridad, mantenibilidad, usabilidad, fiabilidad). La columna </w:t>
-      </w:r>
-      <w:r>
-        <w:rPr>
-          <w:b/>
-          <w:i w:val="0"/>
-          <w:sz w:val="19"/>
-        </w:rPr>
-        <w:t>atributo afectado</w:t>
-      </w:r>
-      <w:r>
-        <w:rPr>
-          <w:b w:val="0"/>
-          <w:i w:val="0"/>
-          <w:sz w:val="19"/>
-        </w:rPr>
-        <w:t xml:space="preserve"> nombra la subcaracterística de </w:t>
-      </w:r>
-      <w:r>
-        <w:rPr>
-          <w:b/>
-          <w:i w:val="0"/>
-          <w:sz w:val="19"/>
-        </w:rPr>
-        <w:t>ISO/IEC 9126</w:t>
-      </w:r>
-      <w:r>
-        <w:rPr>
-          <w:b w:val="0"/>
-          <w:i w:val="0"/>
-          <w:sz w:val="19"/>
-        </w:rPr>
-        <w:t>, el modelo del programa, y la calidad en uso (§5.2).</w:t>
-      </w:r>
-    </w:p>
-    <w:p>
-      <w:pPr>
-        <w:spacing w:after="60"/>
-        <w:ind w:left="432"/>
-      </w:pPr>
-      <w:r>
-        <w:rPr>
-          <w:b/>
-          <w:i w:val="0"/>
-          <w:sz w:val="19"/>
-        </w:rPr>
-        <w:t>Prioridad:</w:t>
-      </w:r>
-      <w:r>
-        <w:rPr>
-          <w:b w:val="0"/>
-          <w:i w:val="0"/>
-          <w:sz w:val="19"/>
-        </w:rPr>
-        <w:t xml:space="preserve"> el par (importancia para el negocio, dificultad técnica), en A alta, M media o B baja.</w:t>
-      </w:r>
-    </w:p>
-    <w:p>
-      <w:pPr>
-        <w:spacing w:after="200"/>
-        <w:ind w:left="432"/>
-      </w:pPr>
-      <w:r>
-        <w:rPr>
-          <w:b/>
-          <w:i w:val="0"/>
-          <w:sz w:val="19"/>
-        </w:rPr>
-        <w:t>De dónde salen los números:</w:t>
-      </w:r>
-      <w:r>
-        <w:rPr>
-          <w:b w:val="0"/>
-          <w:i w:val="0"/>
-          <w:sz w:val="19"/>
-        </w:rPr>
-        <w:t xml:space="preserve"> el 72 % es el criterio que acordaron SERVIparq y Smartmedia; las demás medidas son </w:t>
-      </w:r>
-      <w:r>
-        <w:rPr>
-          <w:b/>
-          <w:i w:val="0"/>
-          <w:sz w:val="19"/>
-        </w:rPr>
-        <w:t>supuestos de diseño</w:t>
-      </w:r>
-      <w:r>
-        <w:rPr>
-          <w:b w:val="0"/>
-          <w:i w:val="0"/>
-          <w:sz w:val="19"/>
-        </w:rPr>
-        <w:t>, declarados como tales.</w:t>
+          <w:sz w:val="22"/>
+        </w:rPr>
+        <w:t>Cada escenario indica su categoría de calidad (la lista de drivers de calidad vista en clase) y la subcaracterística de ISO/IEC 9126 que afecta. La prioridad es el par (importancia para el negocio, dificultad técnica), en A alta, M media o B baja. El 72 % es el criterio que acordaron SERVIparq y Smartmedia; las demás medidas son metas que propone el grupo.</w:t>
       </w:r>
     </w:p>
     <w:tbl>
@@ -23140,7 +22493,7 @@
           <w:i w:val="0"/>
           <w:sz w:val="22"/>
         </w:rPr>
-        <w:t>Cómo leer el despliegue.</w:t>
+        <w:t>El despliegue.</w:t>
       </w:r>
       <w:r>
         <w:rPr>
@@ -23148,7 +22501,7 @@
           <w:i w:val="0"/>
           <w:sz w:val="22"/>
         </w:rPr>
-        <w:t xml:space="preserve"> Arriba, los cuatro dispositivos de los usuarios; al centro, la nube del gobierno de la ciudad con el borde de red, el clúster de los seis servicios, la mensajería, la analítica y la base de datos; abajo, la réplica en una segunda región; a la derecha, los sistemas externos del banco y de la autoridad de tránsito. El dimensionamiento es un supuesto de diseño. Las tres vistas siguientes amplían la lámina para leerla impresa.</w:t>
+        <w:t xml:space="preserve"> Arriba, los cuatro dispositivos de los usuarios; al centro, la nube del gobierno de la ciudad con el borde de red, el clúster de los seis servicios, la mensajería, la analítica y la base de datos; abajo, la réplica en una segunda región; a la derecha, los sistemas externos del banco y de la autoridad de tránsito. El tamaño de los servidores es una estimación. Las figuras 7a a 7c muestran cada zona con más detalle.</w:t>
       </w:r>
     </w:p>
     <w:p>
@@ -24616,7 +23969,7 @@
           <w:i w:val="0"/>
           <w:sz w:val="22"/>
         </w:rPr>
-        <w:t xml:space="preserve">): 0,80 × 0,90 = 0,72. Es un buen punto de partida, pero aplica el mismo número a todas las tareas. Este documento propone </w:t>
+        <w:t xml:space="preserve">): 0,80 × 0,90 = 0,72. Es un buen punto de partida, pero aplica el mismo número a todas las tareas. Proponemos </w:t>
       </w:r>
       <w:r>
         <w:rPr>
@@ -25901,7 +25254,7 @@
                 <w:i w:val="0"/>
                 <w:sz w:val="18"/>
               </w:rPr>
-              <w:t>Este documento; evaluación contra los EAC; prueba de desempeño de los prototipos</w:t>
+              <w:t>Documento de arquitectura; evaluación contra los EAC; prueba de desempeño de los prototipos</w:t>
             </w:r>
           </w:p>
         </w:tc>
@@ -29168,7 +28521,7 @@
           <w:i w:val="0"/>
           <w:sz w:val="22"/>
         </w:rPr>
-        <w:t>, sobre estrategias de implementación y monitoreo. Lo razonable es que haya adoptado el rediseño de la interfaz en los equipos, incorporado las pruebas de desempeño como criterio de aceptación de futuros diseños y revisado la estrategia de implementación por colonia. Este documento propone que ese plan sea la hoja de ruta del §5.3.</w:t>
+        <w:t>, sobre estrategias de implementación y monitoreo. Lo razonable es que haya adoptado el rediseño de la interfaz en los equipos, incorporado las pruebas de desempeño como criterio de aceptación de futuros diseños y revisado la estrategia de implementación por colonia. Nuestra propuesta es que ese plan siga la hoja de ruta del §5.3.</w:t>
       </w:r>
     </w:p>
     <w:p>
@@ -29490,7 +28843,7 @@
           <w:i w:val="0"/>
           <w:sz w:val="22"/>
         </w:rPr>
-        <w:t xml:space="preserve">La consigna permite desarrollar una parte del sistema siguiendo la arquitectura elegida. Se desarrolló el </w:t>
+        <w:t xml:space="preserve">Siguiendo la arquitectura elegida, desarrollamos el </w:t>
       </w:r>
       <w:r>
         <w:rPr>

</xml_diff>